<commit_message>
docs: finalize v0.9.0 validation and runnable example
</commit_message>
<xml_diff>
--- a/user-docs/DeepSeek-Agent-V3-使用说明-0.9.0.docx
+++ b/user-docs/DeepSeek-Agent-V3-使用说明-0.9.0.docx
@@ -2,7 +2,7 @@
 <file path=word/document.xml><?xml version="1.0" encoding="utf-8"?>
 <w:document xmlns:w="http://schemas.openxmlformats.org/wordprocessingml/2006/main" xmlns:m="http://schemas.openxmlformats.org/officeDocument/2006/math" xmlns:r="http://schemas.openxmlformats.org/officeDocument/2006/relationships" xmlns:o="urn:schemas-microsoft-com:office:office" xmlns:v="urn:schemas-microsoft-com:vml" xmlns:w10="urn:schemas-microsoft-com:office:word" xmlns:a="http://schemas.openxmlformats.org/drawingml/2006/main" xmlns:pic="http://schemas.openxmlformats.org/drawingml/2006/picture" xmlns:wp="http://schemas.openxmlformats.org/drawingml/2006/wordprocessingDrawing">
   <w:body>
-    <w:bookmarkStart w:id="30" w:name="deepseek-agent-v3-使用说明0.9.0"/>
+    <w:bookmarkStart w:id="31" w:name="deepseek-agent-v3-使用说明0.9.0"/>
     <w:p>
       <w:pPr>
         <w:pStyle w:val="Heading1"/>
@@ -6529,6 +6529,77 @@
         </w:rPr>
         <w:t xml:space="preserve"> passed</w:t>
       </w:r>
+      <w:r>
+        <w:br/>
+      </w:r>
+      <w:r>
+        <w:rPr>
+          <w:rStyle w:val="VerbatimChar"/>
+        </w:rPr>
+        <w:t xml:space="preserve">GitHub Actions </w:t>
+      </w:r>
+      <w:r>
+        <w:rPr>
+          <w:rStyle w:val="VerbatimChar"/>
+          <w:rFonts w:hint="eastAsia"/>
+        </w:rPr>
+        <w:t xml:space="preserve">运行</w:t>
+      </w:r>
+      <w:r>
+        <w:rPr>
+          <w:rStyle w:val="VerbatimChar"/>
+        </w:rPr>
+        <w:t xml:space="preserve"> </w:t>
+      </w:r>
+      <w:r>
+        <w:rPr>
+          <w:rStyle w:val="VerbatimChar"/>
+          <w:rFonts w:hint="eastAsia"/>
+        </w:rPr>
+        <w:t xml:space="preserve">29257906807：Python</w:t>
+      </w:r>
+      <w:r>
+        <w:rPr>
+          <w:rStyle w:val="VerbatimChar"/>
+        </w:rPr>
+        <w:t xml:space="preserve"> 3.11 / 3.12 / 3.13 </w:t>
+      </w:r>
+      <w:r>
+        <w:rPr>
+          <w:rStyle w:val="VerbatimChar"/>
+          <w:rFonts w:hint="eastAsia"/>
+        </w:rPr>
+        <w:t xml:space="preserve">全部</w:t>
+      </w:r>
+      <w:r>
+        <w:rPr>
+          <w:rStyle w:val="VerbatimChar"/>
+        </w:rPr>
+        <w:t xml:space="preserve"> passed</w:t>
+      </w:r>
+      <w:r>
+        <w:br/>
+      </w:r>
+      <w:r>
+        <w:rPr>
+          <w:rStyle w:val="VerbatimChar"/>
+          <w:rFonts w:hint="eastAsia"/>
+        </w:rPr>
+        <w:t xml:space="preserve">Actions：checkout@v5、setup-python@v6，无</w:t>
+      </w:r>
+      <w:r>
+        <w:rPr>
+          <w:rStyle w:val="VerbatimChar"/>
+        </w:rPr>
+        <w:t xml:space="preserve"> Node.js 20 </w:t>
+      </w:r>
+      <w:r>
+        <w:rPr>
+          <w:rStyle w:val="VerbatimChar"/>
+          <w:rFonts w:hint="eastAsia"/>
+        </w:rPr>
+        <w:t xml:space="preserve">弃用警告</w:t>
+      </w:r>
     </w:p>
     <w:bookmarkEnd w:id="26"/>
     <w:bookmarkStart w:id="27" w:name="参考工程取舍"/>
@@ -6881,13 +6952,266 @@
       </w:r>
     </w:p>
     <w:bookmarkEnd w:id="28"/>
-    <w:bookmarkStart w:id="29" w:name="风险与回滚"/>
+    <w:bookmarkStart w:id="29" w:name="可直接运行的实用案例"/>
     <w:p>
       <w:pPr>
         <w:pStyle w:val="Heading2"/>
       </w:pPr>
       <w:r>
         <w:t xml:space="preserve">15. </w:t>
+      </w:r>
+      <w:r>
+        <w:rPr>
+          <w:rFonts w:hint="eastAsia"/>
+        </w:rPr>
+        <w:t xml:space="preserve">可直接运行的实用案例</w:t>
+      </w:r>
+    </w:p>
+    <w:p>
+      <w:pPr>
+        <w:pStyle w:val="FirstParagraph"/>
+      </w:pPr>
+      <w:r>
+        <w:rPr>
+          <w:rFonts w:hint="eastAsia"/>
+        </w:rPr>
+        <w:t xml:space="preserve">当前目录新增：</w:t>
+      </w:r>
+    </w:p>
+    <w:p>
+      <w:pPr>
+        <w:pStyle w:val="SourceCode"/>
+      </w:pPr>
+      <w:r>
+        <w:rPr>
+          <w:rStyle w:val="VerbatimChar"/>
+          <w:rFonts w:hint="eastAsia"/>
+        </w:rPr>
+        <w:t xml:space="preserve">实用案例-v0.9.0/</w:t>
+      </w:r>
+    </w:p>
+    <w:p>
+      <w:pPr>
+        <w:pStyle w:val="FirstParagraph"/>
+      </w:pPr>
+      <w:r>
+        <w:rPr>
+          <w:rFonts w:hint="eastAsia"/>
+        </w:rPr>
+        <w:t xml:space="preserve">其中</w:t>
+      </w:r>
+      <w:r>
+        <w:t xml:space="preserve"> </w:t>
+      </w:r>
+      <w:r>
+        <w:rPr>
+          <w:rStyle w:val="VerbatimChar"/>
+        </w:rPr>
+        <w:t xml:space="preserve">order-summary-demo/</w:t>
+      </w:r>
+      <w:r>
+        <w:t xml:space="preserve"> </w:t>
+      </w:r>
+      <w:r>
+        <w:rPr>
+          <w:rFonts w:hint="eastAsia"/>
+        </w:rPr>
+        <w:t xml:space="preserve">是一个带真实</w:t>
+      </w:r>
+      <w:r>
+        <w:t xml:space="preserve"> </w:t>
+      </w:r>
+      <w:r>
+        <w:rPr>
+          <w:rFonts w:hint="eastAsia"/>
+        </w:rPr>
+        <w:t xml:space="preserve">CSV、业务规则、故意保留缺陷和回归测试的小型订单汇总项目。先阅读</w:t>
+      </w:r>
+      <w:r>
+        <w:t xml:space="preserve"> </w:t>
+      </w:r>
+      <w:r>
+        <w:rPr>
+          <w:rStyle w:val="VerbatimChar"/>
+          <w:rFonts w:hint="eastAsia"/>
+        </w:rPr>
+        <w:t xml:space="preserve">实用案例-v0.9.0/README.md</w:t>
+      </w:r>
+      <w:r>
+        <w:rPr>
+          <w:rFonts w:hint="eastAsia"/>
+        </w:rPr>
+        <w:t xml:space="preserve">，再依次体验</w:t>
+      </w:r>
+      <w:r>
+        <w:t xml:space="preserve"> simple </w:t>
+      </w:r>
+      <w:r>
+        <w:rPr>
+          <w:rFonts w:hint="eastAsia"/>
+        </w:rPr>
+        <w:t xml:space="preserve">解释、standard</w:t>
+      </w:r>
+      <w:r>
+        <w:t xml:space="preserve"> Bug </w:t>
+      </w:r>
+      <w:r>
+        <w:rPr>
+          <w:rFonts w:hint="eastAsia"/>
+        </w:rPr>
+        <w:t xml:space="preserve">修复、large</w:t>
+      </w:r>
+      <w:r>
+        <w:t xml:space="preserve"> </w:t>
+      </w:r>
+      <w:r>
+        <w:rPr>
+          <w:rFonts w:hint="eastAsia"/>
+        </w:rPr>
+        <w:t xml:space="preserve">全项目分析、deep</w:t>
+      </w:r>
+      <w:r>
+        <w:t xml:space="preserve"> </w:t>
+      </w:r>
+      <w:r>
+        <w:rPr>
+          <w:rFonts w:hint="eastAsia"/>
+        </w:rPr>
+        <w:t xml:space="preserve">财务/安全审计与</w:t>
+      </w:r>
+      <w:r>
+        <w:t xml:space="preserve"> </w:t>
+      </w:r>
+      <w:r>
+        <w:rPr>
+          <w:rStyle w:val="VerbatimChar"/>
+        </w:rPr>
+        <w:t xml:space="preserve">/resume</w:t>
+      </w:r>
+      <w:r>
+        <w:rPr>
+          <w:rFonts w:hint="eastAsia"/>
+        </w:rPr>
+        <w:t xml:space="preserve">。案例基线的</w:t>
+      </w:r>
+      <w:r>
+        <w:t xml:space="preserve"> 2 </w:t>
+      </w:r>
+      <w:r>
+        <w:rPr>
+          <w:rFonts w:hint="eastAsia"/>
+        </w:rPr>
+        <w:t xml:space="preserve">个测试应当失败，这是用于观察</w:t>
+      </w:r>
+      <w:r>
+        <w:t xml:space="preserve"> Agent </w:t>
+      </w:r>
+      <w:r>
+        <w:rPr>
+          <w:rFonts w:hint="eastAsia"/>
+        </w:rPr>
+        <w:t xml:space="preserve">定位和修复过程的预期状态，不属于</w:t>
+      </w:r>
+      <w:r>
+        <w:t xml:space="preserve"> Deep Agent </w:t>
+      </w:r>
+      <w:r>
+        <w:rPr>
+          <w:rFonts w:hint="eastAsia"/>
+        </w:rPr>
+        <w:t xml:space="preserve">主项目测试失败。</w:t>
+      </w:r>
+    </w:p>
+    <w:p>
+      <w:pPr>
+        <w:pStyle w:val="BodyText"/>
+      </w:pPr>
+      <w:r>
+        <w:rPr>
+          <w:rFonts w:hint="eastAsia"/>
+        </w:rPr>
+        <w:t xml:space="preserve">快速开始：</w:t>
+      </w:r>
+    </w:p>
+    <w:p>
+      <w:pPr>
+        <w:pStyle w:val="SourceCode"/>
+      </w:pPr>
+      <w:r>
+        <w:rPr>
+          <w:rStyle w:val="BuiltInTok"/>
+        </w:rPr>
+        <w:t xml:space="preserve">cd</w:t>
+      </w:r>
+      <w:r>
+        <w:rPr>
+          <w:rStyle w:val="NormalTok"/>
+        </w:rPr>
+        <w:t xml:space="preserve"> /mnt/d/detail/deepseek/实用案例-v0.9.0/order-summary-demo</w:t>
+      </w:r>
+      <w:r>
+        <w:br/>
+      </w:r>
+      <w:r>
+        <w:rPr>
+          <w:rStyle w:val="ExtensionTok"/>
+        </w:rPr>
+        <w:t xml:space="preserve">python3</w:t>
+      </w:r>
+      <w:r>
+        <w:rPr>
+          <w:rStyle w:val="NormalTok"/>
+        </w:rPr>
+        <w:t xml:space="preserve"> </w:t>
+      </w:r>
+      <w:r>
+        <w:rPr>
+          <w:rStyle w:val="AttributeTok"/>
+        </w:rPr>
+        <w:t xml:space="preserve">-m</w:t>
+      </w:r>
+      <w:r>
+        <w:rPr>
+          <w:rStyle w:val="NormalTok"/>
+        </w:rPr>
+        <w:t xml:space="preserve"> unittest discover </w:t>
+      </w:r>
+      <w:r>
+        <w:rPr>
+          <w:rStyle w:val="AttributeTok"/>
+        </w:rPr>
+        <w:t xml:space="preserve">-s</w:t>
+      </w:r>
+      <w:r>
+        <w:rPr>
+          <w:rStyle w:val="NormalTok"/>
+        </w:rPr>
+        <w:t xml:space="preserve"> tests </w:t>
+      </w:r>
+      <w:r>
+        <w:rPr>
+          <w:rStyle w:val="AttributeTok"/>
+        </w:rPr>
+        <w:t xml:space="preserve">-v</w:t>
+      </w:r>
+      <w:r>
+        <w:br/>
+      </w:r>
+      <w:r>
+        <w:rPr>
+          <w:rStyle w:val="ExtensionTok"/>
+        </w:rPr>
+        <w:t xml:space="preserve">agent</w:t>
+      </w:r>
+    </w:p>
+    <w:bookmarkEnd w:id="29"/>
+    <w:bookmarkStart w:id="30" w:name="风险与回滚"/>
+    <w:p>
+      <w:pPr>
+        <w:pStyle w:val="Heading2"/>
+      </w:pPr>
+      <w:r>
+        <w:t xml:space="preserve">16. </w:t>
       </w:r>
       <w:r>
         <w:rPr>
@@ -7184,8 +7508,8 @@
         <w:t xml:space="preserve">或项目数据。</w:t>
       </w:r>
     </w:p>
-    <w:bookmarkEnd w:id="29"/>
     <w:bookmarkEnd w:id="30"/>
+    <w:bookmarkEnd w:id="31"/>
     <w:sectPr>
       <w:footnotePr>
         <w:numRestart w:val="eachSect"/>

</xml_diff>